<commit_message>
docs(board): rewrite master plan as team proposal, add workflow, update roles
Co-Authored-By: Claude Opus 4.8 <noreply@anthropic.com>
Claude-Session: https://claude.ai/code/session_01PQRQztjXBkaMQdNL9Umfs8
</commit_message>
<xml_diff>
--- a/documentation/fundraising/docx/plan-maestro-junta.docx
+++ b/documentation/fundraising/docx/plan-maestro-junta.docx
@@ -28,7 +28,7 @@
         </w:p>
       </w:sdtContent>
     </w:sdt>
-    <w:bookmarkStart w:id="31" w:name="X7de2ba66ec0cb5042d730aec0c8ac594bd83adf"/>
+    <w:bookmarkStart w:id="32" w:name="X7de2ba66ec0cb5042d730aec0c8ac594bd83adf"/>
     <w:p>
       <w:pPr>
         <w:pStyle w:val="Heading1"/>
@@ -37,13 +37,13 @@
         <w:t xml:space="preserve">Plan Maestro — Resolución de Cartera y Protección de la Firma</w:t>
       </w:r>
     </w:p>
-    <w:bookmarkStart w:id="20" w:name="X034a65f4d01381f44673b53321bc88b593c9d5f"/>
+    <w:bookmarkStart w:id="20" w:name="Xfa31ce85cb86833c2b36caf1f971e6fb9ec4ade"/>
     <w:p>
       <w:pPr>
         <w:pStyle w:val="Heading2"/>
       </w:pPr>
       <w:r>
-        <w:t xml:space="preserve">Documento para la Junta Directiva · Law Offices Santiago</w:t>
+        <w:t xml:space="preserve">Propuesta del Equipo Multidisciplinario · Para la Junta Directiva · Law Offices Santiago</w:t>
       </w:r>
     </w:p>
     <w:p>
@@ -55,13 +55,13 @@
           <w:bCs/>
           <w:b/>
         </w:rPr>
-        <w:t xml:space="preserve">Preparado para:</w:t>
-      </w:r>
-      <w:r>
-        <w:t xml:space="preserve"> </w:t>
-      </w:r>
-      <w:r>
-        <w:t xml:space="preserve">Junta Directiva</w:t>
+        <w:t xml:space="preserve">Presentado por:</w:t>
+      </w:r>
+      <w:r>
+        <w:t xml:space="preserve"> </w:t>
+      </w:r>
+      <w:r>
+        <w:t xml:space="preserve">Equipo de Resolución de Cartera (Legal · Contabilidad · Cuentas por Cobrar · Cobranza)</w:t>
       </w:r>
       <w:r>
         <w:t xml:space="preserve"> </w:t>
@@ -77,7 +77,7 @@
         <w:t xml:space="preserve"> </w:t>
       </w:r>
       <w:r>
-        <w:t xml:space="preserve">Plan para resolver ~800 cuentas de cartera vencida y</w:t>
+        <w:t xml:space="preserve">Sistema para resolver ~800 cuentas de cartera vencida y</w:t>
       </w:r>
       <w:r>
         <w:t xml:space="preserve"> </w:t>
@@ -125,7 +125,19 @@
         <w:t xml:space="preserve"> </w:t>
       </w:r>
       <w:r>
-        <w:t xml:space="preserve">Decisión estratégica y de gobernanza — se solicitan aprobaciones (Sección 8)</w:t>
+        <w:t xml:space="preserve">Recomendación institucional del equipo — se solicitan aprobaciones de la Junta (Sección 9)</w:t>
+      </w:r>
+    </w:p>
+    <w:p>
+      <w:pPr>
+        <w:pStyle w:val="BlockText"/>
+      </w:pPr>
+      <w:r>
+        <w:rPr>
+          <w:iCs/>
+          <w:i/>
+        </w:rPr>
+        <w:t xml:space="preserve">Este documento es una recomendación conjunta de un equipo multidisciplinario de la firma. No refleja la posición de una sola persona ni un señalamiento a ningún área; es el resultado de un análisis colaborativo orientado a proteger a la firma y a fortalecer su operación.</w:t>
       </w:r>
     </w:p>
     <w:p>
@@ -150,7 +162,7 @@
         <w:pStyle w:val="FirstParagraph"/>
       </w:pPr>
       <w:r>
-        <w:t xml:space="preserve">La firma tiene aproximadamente</w:t>
+        <w:t xml:space="preserve">La firma administra aproximadamente</w:t>
       </w:r>
       <w:r>
         <w:t xml:space="preserve"> </w:t>
@@ -179,7 +191,7 @@
         <w:t xml:space="preserve">más de $1,000,000</w:t>
       </w:r>
       <w:r>
-        <w:t xml:space="preserve">. Más allá del monto, la situación genera una</w:t>
+        <w:t xml:space="preserve">. El equipo que suscribe esta propuesta —integrado por las áreas Legal, Contabilidad, Cuentas por Cobrar y Cobranza— coincide en que la prioridad no es únicamente el monto, sino la</w:t>
       </w:r>
       <w:r>
         <w:t xml:space="preserve"> </w:t>
@@ -192,10 +204,7 @@
         <w:t xml:space="preserve">exposición institucional</w:t>
       </w:r>
       <w:r>
-        <w:t xml:space="preserve"> </w:t>
-      </w:r>
-      <w:r>
-        <w:t xml:space="preserve">creciente: los tribunales de inmigración (EOIR) están observando la forma en que la firma gestiona los casos de clientes que dejaron de pagar, y una gestión inconsistente nos expone a</w:t>
+        <w:t xml:space="preserve">: la forma en que la firma gestiona los casos de clientes que dejaron de pagar está siendo observada por los tribunales de inmigración (EOIR) y puede derivar en</w:t>
       </w:r>
       <w:r>
         <w:t xml:space="preserve"> </w:t>
@@ -216,30 +225,33 @@
         <w:pStyle w:val="BodyText"/>
       </w:pPr>
       <w:r>
-        <w:t xml:space="preserve">Este es un</w:t>
-      </w:r>
-      <w:r>
-        <w:t xml:space="preserve"> </w:t>
-      </w:r>
-      <w:r>
-        <w:rPr>
-          <w:bCs/>
-          <w:b/>
-        </w:rPr>
-        <w:t xml:space="preserve">problema de proceso y de capacidad</w:t>
-      </w:r>
-      <w:r>
-        <w:t xml:space="preserve">, no de personas: el volumen de cuentas superó la capacidad del proceso actual para resolverlas a tiempo. La solución no es señalar culpables — es</w:t>
-      </w:r>
-      <w:r>
-        <w:t xml:space="preserve"> </w:t>
-      </w:r>
-      <w:r>
-        <w:rPr>
-          <w:bCs/>
-          <w:b/>
-        </w:rPr>
-        <w:t xml:space="preserve">instalar un sistema</w:t>
+        <w:t xml:space="preserve">El diagnóstico compartido del equipo es claro:</w:t>
+      </w:r>
+      <w:r>
+        <w:t xml:space="preserve"> </w:t>
+      </w:r>
+      <w:r>
+        <w:rPr>
+          <w:bCs/>
+          <w:b/>
+        </w:rPr>
+        <w:t xml:space="preserve">este es un reto de proceso y de capacidad, no de personas.</w:t>
+      </w:r>
+      <w:r>
+        <w:t xml:space="preserve"> </w:t>
+      </w:r>
+      <w:r>
+        <w:t xml:space="preserve">El volumen de cuentas creció por encima de la capacidad del sistema actual para resolverlas a tiempo — una consecuencia natural del crecimiento de la firma. La respuesta que proponemos no mira hacia atrás:</w:t>
+      </w:r>
+      <w:r>
+        <w:t xml:space="preserve"> </w:t>
+      </w:r>
+      <w:r>
+        <w:rPr>
+          <w:bCs/>
+          <w:b/>
+        </w:rPr>
+        <w:t xml:space="preserve">instala un sistema</w:t>
       </w:r>
       <w:r>
         <w:t xml:space="preserve"> </w:t>
@@ -296,13 +308,13 @@
           <w:bCs/>
           <w:b/>
         </w:rPr>
-        <w:t xml:space="preserve">Lo que se pide a la Junta:</w:t>
-      </w:r>
-      <w:r>
-        <w:t xml:space="preserve"> </w:t>
-      </w:r>
-      <w:r>
-        <w:t xml:space="preserve">aprobar el sistema de resolución, la política de</w:t>
+        <w:t xml:space="preserve">Lo que el equipo solicita a la Junta:</w:t>
+      </w:r>
+      <w:r>
+        <w:t xml:space="preserve"> </w:t>
+      </w:r>
+      <w:r>
+        <w:t xml:space="preserve">avalar el sistema, la política de</w:t>
       </w:r>
       <w:r>
         <w:t xml:space="preserve"> </w:t>
@@ -317,7 +329,7 @@
         <w:t xml:space="preserve">”</w:t>
       </w:r>
       <w:r>
-        <w:t xml:space="preserve">, los recursos de apoyo y la autoridad para ejecutarlo en 6 meses (Sección 8).</w:t>
+        <w:t xml:space="preserve">, la estructura de trabajo y la autoridad para ejecutarlo en 6 meses (Sección 9).</w:t>
       </w:r>
     </w:p>
     <w:p>
@@ -517,29 +529,45 @@
           <w:bCs/>
           <w:b/>
         </w:rPr>
-        <w:t xml:space="preserve">Causa raíz (sin personalizar):</w:t>
-      </w:r>
-      <w:r>
-        <w:t xml:space="preserve"> </w:t>
-      </w:r>
-      <w:r>
-        <w:t xml:space="preserve">el volumen de cuentas creció más rápido que la capacidad del proceso de cobranza y seguimiento. Cuando un proceso diseñado para un volumen se enfrenta a otro mucho mayor, se acumula un rezago —</w:t>
-      </w:r>
-      <w:r>
-        <w:t xml:space="preserve"> </w:t>
-      </w:r>
-      <w:r>
-        <w:rPr>
-          <w:bCs/>
-          <w:b/>
-        </w:rPr>
-        <w:t xml:space="preserve">es un problema estructural predecible, no una falla individual.</w:t>
-      </w:r>
-      <w:r>
-        <w:t xml:space="preserve"> </w:t>
-      </w:r>
-      <w:r>
-        <w:t xml:space="preserve">El objetivo de la Junta hoy no es mirar atrás; es autorizar el sistema que cierra esa brecha.</w:t>
+        <w:t xml:space="preserve">Lectura del equipo (sin personalizar):</w:t>
+      </w:r>
+      <w:r>
+        <w:t xml:space="preserve"> </w:t>
+      </w:r>
+      <w:r>
+        <w:t xml:space="preserve">cuando el volumen de cuentas crece más rápido que el proceso diseñado para atenderlas, se acumula un rezago. Es un fenómeno estructural y</w:t>
+      </w:r>
+      <w:r>
+        <w:t xml:space="preserve"> </w:t>
+      </w:r>
+      <w:r>
+        <w:rPr>
+          <w:bCs/>
+          <w:b/>
+        </w:rPr>
+        <w:t xml:space="preserve">predecible</w:t>
+      </w:r>
+      <w:r>
+        <w:t xml:space="preserve"> </w:t>
+      </w:r>
+      <w:r>
+        <w:t xml:space="preserve">en toda firma en expansión — no una falla de ninguna persona ni de ninguna área. El mérito de traer esto a la Junta hoy es precisamente</w:t>
+      </w:r>
+      <w:r>
+        <w:t xml:space="preserve"> </w:t>
+      </w:r>
+      <w:r>
+        <w:rPr>
+          <w:bCs/>
+          <w:b/>
+        </w:rPr>
+        <w:t xml:space="preserve">anticiparse</w:t>
+      </w:r>
+      <w:r>
+        <w:t xml:space="preserve"> </w:t>
+      </w:r>
+      <w:r>
+        <w:t xml:space="preserve">y corregir el rumbo por iniciativa propia.</w:t>
       </w:r>
     </w:p>
     <w:p>
@@ -564,7 +592,7 @@
         <w:pStyle w:val="FirstParagraph"/>
       </w:pPr>
       <w:r>
-        <w:t xml:space="preserve">La urgencia no es una opinión interna — la marca la</w:t>
+        <w:t xml:space="preserve">La urgencia no es una postura interna — la define la</w:t>
       </w:r>
       <w:r>
         <w:t xml:space="preserve"> </w:t>
@@ -599,7 +627,7 @@
         <w:t xml:space="preserve"> </w:t>
       </w:r>
       <w:r>
-        <w:t xml:space="preserve">están mostrando inconformidad con mociones de retiro presentadas sin la documentación adecuada. Cada moción deficiente erosiona la credibilidad de la firma ante la Corte.</w:t>
+        <w:t xml:space="preserve">han manifestado inconformidad con mociones de retiro presentadas sin la documentación adecuada. Cada moción deficiente erosiona la credibilidad de la firma ante la Corte.</w:t>
       </w:r>
     </w:p>
     <w:p>
@@ -615,13 +643,13 @@
           <w:bCs/>
           <w:b/>
         </w:rPr>
-        <w:t xml:space="preserve">Riesgo de queja ante el bar:</w:t>
-      </w:r>
-      <w:r>
-        <w:t xml:space="preserve"> </w:t>
-      </w:r>
-      <w:r>
-        <w:t xml:space="preserve">cobrar honorarios no devengados o abandonar a un cliente sin proceso adecuado son las causas más comunes de quejas disciplinarias.</w:t>
+        <w:t xml:space="preserve">Riesgo ante el bar:</w:t>
+      </w:r>
+      <w:r>
+        <w:t xml:space="preserve"> </w:t>
+      </w:r>
+      <w:r>
+        <w:t xml:space="preserve">cobrar honorarios no devengados o terminar una representación sin el debido proceso son de las causas más frecuentes de quejas disciplinarias.</w:t>
       </w:r>
     </w:p>
     <w:p>
@@ -643,7 +671,7 @@
         <w:t xml:space="preserve"> </w:t>
       </w:r>
       <w:r>
-        <w:t xml:space="preserve">dejar a un cliente sin representación cerca de una audiencia puede derivar en reclamos serios.</w:t>
+        <w:t xml:space="preserve">dejar a un cliente sin representación cerca de una audiencia puede generar reclamos serios.</w:t>
       </w:r>
     </w:p>
     <w:p>
@@ -661,7 +689,7 @@
         <w:t xml:space="preserve"> </w:t>
       </w:r>
       <w:r>
-        <w:t xml:space="preserve">que una cuenta con audiencia próxima queda sin resolver. Esta es la razón por la que el tema llega a la Junta ahora y no después.</w:t>
+        <w:t xml:space="preserve">que una cuenta con audiencia próxima permanece sin resolver. Por eso el equipo eleva el tema a la Junta ahora.</w:t>
       </w:r>
     </w:p>
     <w:p>
@@ -702,7 +730,7 @@
         <w:t xml:space="preserve"> </w:t>
       </w:r>
       <w:r>
-        <w:t xml:space="preserve">vía documentada — ninguna se queda sin resolver:</w:t>
+        <w:t xml:space="preserve">vía documentada — ninguna queda en el limbo:</w:t>
       </w:r>
     </w:p>
     <w:p>
@@ -737,7 +765,7 @@
         <w:t xml:space="preserve">devengado</w:t>
       </w:r>
       <w:r>
-        <w:t xml:space="preserve">, mediante plan de pago o acuerdo, y reenganchar el caso.</w:t>
+        <w:t xml:space="preserve">, mediante plan de pago o acuerdo, y dar continuidad al caso.</w:t>
       </w:r>
     </w:p>
     <w:p>
@@ -803,7 +831,7 @@
         <w:t xml:space="preserve"> </w:t>
       </w:r>
       <w:r>
-        <w:t xml:space="preserve">proteger al cliente y satisfacer a la Corte es, a la vez, lo que protege a la firma. Hacer las cosas bien</w:t>
+        <w:t xml:space="preserve">proteger al cliente y satisfacer a la Corte es, al mismo tiempo, lo que protege a la firma. Hacer las cosas bien</w:t>
       </w:r>
       <w:r>
         <w:t xml:space="preserve"> </w:t>
@@ -827,46 +855,17 @@
         <w:pStyle w:val="BlockText"/>
       </w:pPr>
       <w:r>
-        <w:t xml:space="preserve">El detalle operativo (triage por fecha de audiencia, checklist de documentación por caso, tablero y KPIs) está desarrollado en el</w:t>
-      </w:r>
-      <w:r>
-        <w:t xml:space="preserve"> </w:t>
-      </w:r>
-      <w:r>
-        <w:rPr>
-          <w:bCs/>
-          <w:b/>
-        </w:rPr>
-        <w:t xml:space="preserve">Plan de Ejecución</w:t>
-      </w:r>
-      <w:r>
-        <w:t xml:space="preserve"> </w:t>
-      </w:r>
-      <w:r>
-        <w:t xml:space="preserve">anexo. Este documento pide a la Junta la</w:t>
-      </w:r>
-      <w:r>
-        <w:t xml:space="preserve"> </w:t>
-      </w:r>
-      <w:r>
-        <w:rPr>
-          <w:bCs/>
-          <w:b/>
-        </w:rPr>
-        <w:t xml:space="preserve">decisión</w:t>
-      </w:r>
-      <w:r>
-        <w:t xml:space="preserve">; el anexo describe el</w:t>
-      </w:r>
-      <w:r>
-        <w:t xml:space="preserve"> </w:t>
-      </w:r>
-      <w:r>
-        <w:rPr>
-          <w:bCs/>
-          <w:b/>
-        </w:rPr>
-        <w:t xml:space="preserve">cómo</w:t>
+        <w:t xml:space="preserve">El flujo de trabajo detallado (quién hace qué, en qué orden) se describe en la Sección 6 y en el</w:t>
+      </w:r>
+      <w:r>
+        <w:t xml:space="preserve"> </w:t>
+      </w:r>
+      <w:r>
+        <w:rPr>
+          <w:bCs/>
+          <w:b/>
+        </w:rPr>
+        <w:t xml:space="preserve">Workflow anexo</w:t>
       </w:r>
       <w:r>
         <w:t xml:space="preserve">.</w:t>
@@ -880,13 +879,13 @@
       </w:r>
     </w:p>
     <w:bookmarkEnd w:id="24"/>
-    <w:bookmarkStart w:id="25" w:name="gobernanza-y-estructura-del-equipo"/>
+    <w:bookmarkStart w:id="25" w:name="estructura-del-equipo-gobernanza"/>
     <w:p>
       <w:pPr>
         <w:pStyle w:val="Heading2"/>
       </w:pPr>
       <w:r>
-        <w:t xml:space="preserve">5. Gobernanza y estructura del equipo</w:t>
+        <w:t xml:space="preserve">5. Estructura del equipo (gobernanza)</w:t>
       </w:r>
     </w:p>
     <w:p>
@@ -910,7 +909,7 @@
         <w:t xml:space="preserve"> </w:t>
       </w:r>
       <w:r>
-        <w:t xml:space="preserve">de 6 meses, con separación clara de responsabilidades:</w:t>
+        <w:t xml:space="preserve">de 6 meses, con roles complementarios y control distribuido. Cada área aporta su fortaleza:</w:t>
       </w:r>
     </w:p>
     <w:tbl>
@@ -921,9 +920,9 @@
         <w:jc w:val="start"/>
       </w:tblPr>
       <w:tblGrid>
-        <w:gridCol w:w="1875"/>
-        <w:gridCol w:w="3334"/>
-        <w:gridCol w:w="2709"/>
+        <w:gridCol w:w="965"/>
+        <w:gridCol w:w="1738"/>
+        <w:gridCol w:w="5215"/>
       </w:tblGrid>
       <w:tr>
         <w:trPr>
@@ -937,31 +936,31 @@
               <w:jc w:val="left"/>
             </w:pPr>
             <w:r>
-              <w:t xml:space="preserve">Función</w:t>
-            </w:r>
-          </w:p>
-        </w:tc>
-        <w:tc>
-          <w:tcPr/>
-          <w:p>
-            <w:pPr>
-              <w:pStyle w:val="Compact"/>
-              <w:jc w:val="left"/>
-            </w:pPr>
-            <w:r>
-              <w:t xml:space="preserve">Responsabilidad</w:t>
-            </w:r>
-          </w:p>
-        </w:tc>
-        <w:tc>
-          <w:tcPr/>
-          <w:p>
-            <w:pPr>
-              <w:pStyle w:val="Compact"/>
-              <w:jc w:val="left"/>
-            </w:pPr>
-            <w:r>
-              <w:t xml:space="preserve">Por qué así</w:t>
+              <w:t xml:space="preserve">Rol</w:t>
+            </w:r>
+          </w:p>
+        </w:tc>
+        <w:tc>
+          <w:tcPr/>
+          <w:p>
+            <w:pPr>
+              <w:pStyle w:val="Compact"/>
+              <w:jc w:val="left"/>
+            </w:pPr>
+            <w:r>
+              <w:t xml:space="preserve">Titular</w:t>
+            </w:r>
+          </w:p>
+        </w:tc>
+        <w:tc>
+          <w:tcPr/>
+          <w:p>
+            <w:pPr>
+              <w:pStyle w:val="Compact"/>
+              <w:jc w:val="left"/>
+            </w:pPr>
+            <w:r>
+              <w:t xml:space="preserve">Responsabilidad principal</w:t>
             </w:r>
           </w:p>
         </w:tc>
@@ -979,131 +978,228 @@
                 <w:bCs/>
                 <w:b/>
               </w:rPr>
-              <w:t xml:space="preserve">Abogada responsable</w:t>
-            </w:r>
-          </w:p>
-        </w:tc>
-        <w:tc>
-          <w:tcPr/>
-          <w:p>
-            <w:pPr>
-              <w:pStyle w:val="Compact"/>
-              <w:jc w:val="left"/>
-            </w:pPr>
-            <w:r>
-              <w:t xml:space="preserve">Firma las mociones, aprueba criterios legales y reembolsos, asume la responsabilidad ante la Corte y el bar</w:t>
-            </w:r>
-          </w:p>
-        </w:tc>
-        <w:tc>
-          <w:tcPr/>
-          <w:p>
-            <w:pPr>
-              <w:pStyle w:val="Compact"/>
-              <w:jc w:val="left"/>
-            </w:pPr>
-            <w:r>
-              <w:t xml:space="preserve">La responsabilidad profesional exige supervisión de un abogado</w:t>
-            </w:r>
-          </w:p>
-        </w:tc>
-      </w:tr>
-      <w:tr>
-        <w:tc>
-          <w:tcPr/>
-          <w:p>
-            <w:pPr>
-              <w:pStyle w:val="Compact"/>
-              <w:jc w:val="left"/>
-            </w:pPr>
+              <w:t xml:space="preserve">Revisión Legal</w:t>
+            </w:r>
+          </w:p>
+        </w:tc>
+        <w:tc>
+          <w:tcPr/>
+          <w:p>
+            <w:pPr>
+              <w:pStyle w:val="Compact"/>
+              <w:jc w:val="left"/>
+            </w:pPr>
+            <w:r>
+              <w:t xml:space="preserve">Abogado(a) revisor(a)</w:t>
+            </w:r>
+          </w:p>
+        </w:tc>
+        <w:tc>
+          <w:tcPr/>
+          <w:p>
+            <w:pPr>
+              <w:pStyle w:val="Compact"/>
+              <w:jc w:val="left"/>
+            </w:pPr>
+            <w:r>
+              <w:t xml:space="preserve">Decide, caso por caso,</w:t>
+            </w:r>
+            <w:r>
+              <w:t xml:space="preserve"> </w:t>
+            </w:r>
             <w:r>
               <w:rPr>
                 <w:bCs/>
                 <w:b/>
               </w:rPr>
-              <w:t xml:space="preserve">Coordinación de resolución</w:t>
-            </w:r>
-            <w:r>
-              <w:t xml:space="preserve"> </w:t>
-            </w:r>
-            <w:r>
-              <w:t xml:space="preserve">(persona a cargo del cobro)</w:t>
-            </w:r>
-          </w:p>
-        </w:tc>
-        <w:tc>
-          <w:tcPr/>
-          <w:p>
-            <w:pPr>
-              <w:pStyle w:val="Compact"/>
-              <w:jc w:val="left"/>
-            </w:pPr>
-            <w:r>
-              <w:t xml:space="preserve">Ejecuta el triage, el contacto con clientes y los planes de pago; ahora</w:t>
-            </w:r>
-            <w:r>
-              <w:t xml:space="preserve"> </w:t>
-            </w:r>
+              <w:t xml:space="preserve">si conviene o no retirarse</w:t>
+            </w:r>
+            <w:r>
+              <w:t xml:space="preserve">; firma las mociones; asume la responsabilidad ante la Corte y el bar</w:t>
+            </w:r>
+          </w:p>
+        </w:tc>
+      </w:tr>
+      <w:tr>
+        <w:tc>
+          <w:tcPr/>
+          <w:p>
+            <w:pPr>
+              <w:pStyle w:val="Compact"/>
+              <w:jc w:val="left"/>
+            </w:pPr>
             <w:r>
               <w:rPr>
                 <w:bCs/>
                 <w:b/>
               </w:rPr>
-              <w:t xml:space="preserve">con apoyo dedicado y un sistema</w:t>
-            </w:r>
-          </w:p>
-        </w:tc>
-        <w:tc>
-          <w:tcPr/>
-          <w:p>
-            <w:pPr>
-              <w:pStyle w:val="Compact"/>
-              <w:jc w:val="left"/>
-            </w:pPr>
-            <w:r>
-              <w:t xml:space="preserve">Se le dota de proceso, herramientas y refuerzo para tener éxito</w:t>
-            </w:r>
-          </w:p>
-        </w:tc>
-      </w:tr>
-      <w:tr>
-        <w:tc>
-          <w:tcPr/>
-          <w:p>
-            <w:pPr>
-              <w:pStyle w:val="Compact"/>
-              <w:jc w:val="left"/>
-            </w:pPr>
+              <w:t xml:space="preserve">Liderazgo de la operación</w:t>
+            </w:r>
+          </w:p>
+        </w:tc>
+        <w:tc>
+          <w:tcPr/>
+          <w:p>
+            <w:pPr>
+              <w:pStyle w:val="Compact"/>
+              <w:jc w:val="left"/>
+            </w:pPr>
+            <w:r>
+              <w:t xml:space="preserve">Jefe(a) del Departamento de Contabilidad</w:t>
+            </w:r>
+          </w:p>
+        </w:tc>
+        <w:tc>
+          <w:tcPr/>
+          <w:p>
+            <w:pPr>
+              <w:pStyle w:val="Compact"/>
+              <w:jc w:val="left"/>
+            </w:pPr>
+            <w:r>
+              <w:t xml:space="preserve">Dirige la operación, integra los números y</w:t>
+            </w:r>
+            <w:r>
+              <w:t xml:space="preserve"> </w:t>
+            </w:r>
             <w:r>
               <w:rPr>
                 <w:bCs/>
                 <w:b/>
               </w:rPr>
-              <w:t xml:space="preserve">Apoyo de documentación</w:t>
-            </w:r>
-          </w:p>
-        </w:tc>
-        <w:tc>
-          <w:tcPr/>
-          <w:p>
-            <w:pPr>
-              <w:pStyle w:val="Compact"/>
-              <w:jc w:val="left"/>
-            </w:pPr>
-            <w:r>
-              <w:t xml:space="preserve">Blinda el expediente de cada caso y vigila el calendario de audiencias</w:t>
-            </w:r>
-          </w:p>
-        </w:tc>
-        <w:tc>
-          <w:tcPr/>
-          <w:p>
-            <w:pPr>
-              <w:pStyle w:val="Compact"/>
-              <w:jc w:val="left"/>
-            </w:pPr>
-            <w:r>
-              <w:t xml:space="preserve">El calendario es el corazón del riesgo — no puede depender de una sola persona</w:t>
+              <w:t xml:space="preserve">reporta a la Junta</w:t>
+            </w:r>
+          </w:p>
+        </w:tc>
+      </w:tr>
+      <w:tr>
+        <w:tc>
+          <w:tcPr/>
+          <w:p>
+            <w:pPr>
+              <w:pStyle w:val="Compact"/>
+              <w:jc w:val="left"/>
+            </w:pPr>
+            <w:r>
+              <w:rPr>
+                <w:bCs/>
+                <w:b/>
+              </w:rPr>
+              <w:t xml:space="preserve">Coordinación de Cuentas por Cobrar</w:t>
+            </w:r>
+          </w:p>
+        </w:tc>
+        <w:tc>
+          <w:tcPr/>
+          <w:p>
+            <w:pPr>
+              <w:pStyle w:val="Compact"/>
+              <w:jc w:val="left"/>
+            </w:pPr>
+            <w:r>
+              <w:t xml:space="preserve">2 coordinadores(as)</w:t>
+            </w:r>
+          </w:p>
+        </w:tc>
+        <w:tc>
+          <w:tcPr/>
+          <w:p>
+            <w:pPr>
+              <w:pStyle w:val="Compact"/>
+              <w:jc w:val="left"/>
+            </w:pPr>
+            <w:r>
+              <w:t xml:space="preserve">Arman el expediente de cada cuenta, gestionan planes de pago y mantienen el tablero</w:t>
+            </w:r>
+          </w:p>
+        </w:tc>
+      </w:tr>
+      <w:tr>
+        <w:tc>
+          <w:tcPr/>
+          <w:p>
+            <w:pPr>
+              <w:pStyle w:val="Compact"/>
+              <w:jc w:val="left"/>
+            </w:pPr>
+            <w:r>
+              <w:rPr>
+                <w:bCs/>
+                <w:b/>
+              </w:rPr>
+              <w:t xml:space="preserve">Cobranza</w:t>
+            </w:r>
+          </w:p>
+        </w:tc>
+        <w:tc>
+          <w:tcPr/>
+          <w:p>
+            <w:pPr>
+              <w:pStyle w:val="Compact"/>
+              <w:jc w:val="left"/>
+            </w:pPr>
+            <w:r>
+              <w:t xml:space="preserve">Encargado(a) de cobranza</w:t>
+            </w:r>
+          </w:p>
+        </w:tc>
+        <w:tc>
+          <w:tcPr/>
+          <w:p>
+            <w:pPr>
+              <w:pStyle w:val="Compact"/>
+              <w:jc w:val="left"/>
+            </w:pPr>
+            <w:r>
+              <w:t xml:space="preserve">Contacta a los clientes y ejecuta el cobro y los acuerdos</w:t>
+            </w:r>
+          </w:p>
+        </w:tc>
+      </w:tr>
+      <w:tr>
+        <w:tc>
+          <w:tcPr/>
+          <w:p>
+            <w:pPr>
+              <w:pStyle w:val="Compact"/>
+              <w:jc w:val="left"/>
+            </w:pPr>
+            <w:r>
+              <w:rPr>
+                <w:bCs/>
+                <w:b/>
+              </w:rPr>
+              <w:t xml:space="preserve">Apoyo temporal</w:t>
+            </w:r>
+            <w:r>
+              <w:t xml:space="preserve"> </w:t>
+            </w:r>
+            <w:r>
+              <w:t xml:space="preserve">(opcional)</w:t>
+            </w:r>
+          </w:p>
+        </w:tc>
+        <w:tc>
+          <w:tcPr/>
+          <w:p>
+            <w:pPr>
+              <w:pStyle w:val="Compact"/>
+              <w:jc w:val="left"/>
+            </w:pPr>
+            <w:r>
+              <w:t xml:space="preserve">Refuerzo puntual</w:t>
+            </w:r>
+          </w:p>
+        </w:tc>
+        <w:tc>
+          <w:tcPr/>
+          <w:p>
+            <w:pPr>
+              <w:pStyle w:val="Compact"/>
+              <w:jc w:val="left"/>
+            </w:pPr>
+            <w:r>
+              <w:t xml:space="preserve">Asiste en la cobranza durante los picos de volumen</w:t>
             </w:r>
           </w:p>
         </w:tc>
@@ -1118,45 +1214,89 @@
           <w:bCs/>
           <w:b/>
         </w:rPr>
-        <w:t xml:space="preserve">Nota de gobernanza:</w:t>
-      </w:r>
-      <w:r>
-        <w:t xml:space="preserve"> </w:t>
-      </w:r>
-      <w:r>
-        <w:t xml:space="preserve">el diseño</w:t>
-      </w:r>
-      <w:r>
-        <w:t xml:space="preserve"> </w:t>
-      </w:r>
-      <w:r>
-        <w:rPr>
-          <w:bCs/>
-          <w:b/>
-        </w:rPr>
-        <w:t xml:space="preserve">refuerza</w:t>
-      </w:r>
-      <w:r>
-        <w:t xml:space="preserve"> </w:t>
-      </w:r>
-      <w:r>
-        <w:t xml:space="preserve">a quien hoy tiene el cobro, dándole un sistema, apoyo y criterios claros, y</w:t>
-      </w:r>
-      <w:r>
-        <w:t xml:space="preserve"> </w:t>
-      </w:r>
-      <w:r>
-        <w:rPr>
-          <w:bCs/>
-          <w:b/>
-        </w:rPr>
-        <w:t xml:space="preserve">distribuye el control</w:t>
-      </w:r>
-      <w:r>
-        <w:t xml:space="preserve"> </w:t>
-      </w:r>
-      <w:r>
-        <w:t xml:space="preserve">(documentación y calendario independientes) para que ningún caso dependa de una sola persona. Esto protege tanto a la firma como a cada integrante del equipo.</w:t>
+        <w:t xml:space="preserve">Nota de gobernanza (por qué esta estructura protege a todos):</w:t>
+      </w:r>
+      <w:r>
+        <w:t xml:space="preserve"> </w:t>
+      </w:r>
+      <w:r>
+        <w:t xml:space="preserve">- La</w:t>
+      </w:r>
+      <w:r>
+        <w:t xml:space="preserve"> </w:t>
+      </w:r>
+      <w:r>
+        <w:rPr>
+          <w:bCs/>
+          <w:b/>
+        </w:rPr>
+        <w:t xml:space="preserve">decisión legal</w:t>
+      </w:r>
+      <w:r>
+        <w:t xml:space="preserve"> </w:t>
+      </w:r>
+      <w:r>
+        <w:t xml:space="preserve">de retirarse o no recae en el abogado, como lo exige la responsabilidad profesional — no en el área de cobranza.</w:t>
+      </w:r>
+      <w:r>
+        <w:t xml:space="preserve"> </w:t>
+      </w:r>
+      <w:r>
+        <w:t xml:space="preserve">- La</w:t>
+      </w:r>
+      <w:r>
+        <w:t xml:space="preserve"> </w:t>
+      </w:r>
+      <w:r>
+        <w:rPr>
+          <w:bCs/>
+          <w:b/>
+        </w:rPr>
+        <w:t xml:space="preserve">contabilidad lidera y reporta</w:t>
+      </w:r>
+      <w:r>
+        <w:t xml:space="preserve">, dando transparencia a la Junta.</w:t>
+      </w:r>
+      <w:r>
+        <w:t xml:space="preserve"> </w:t>
+      </w:r>
+      <w:r>
+        <w:t xml:space="preserve">- La</w:t>
+      </w:r>
+      <w:r>
+        <w:t xml:space="preserve"> </w:t>
+      </w:r>
+      <w:r>
+        <w:rPr>
+          <w:bCs/>
+          <w:b/>
+        </w:rPr>
+        <w:t xml:space="preserve">cobranza cuenta con apoyo y un sistema</w:t>
+      </w:r>
+      <w:r>
+        <w:t xml:space="preserve">, en lugar de cargar sola con un volumen imposible.</w:t>
+      </w:r>
+      <w:r>
+        <w:t xml:space="preserve"> </w:t>
+      </w:r>
+      <w:r>
+        <w:t xml:space="preserve">- El</w:t>
+      </w:r>
+      <w:r>
+        <w:t xml:space="preserve"> </w:t>
+      </w:r>
+      <w:r>
+        <w:rPr>
+          <w:bCs/>
+          <w:b/>
+        </w:rPr>
+        <w:t xml:space="preserve">control distribuido</w:t>
+      </w:r>
+      <w:r>
+        <w:t xml:space="preserve"> </w:t>
+      </w:r>
+      <w:r>
+        <w:t xml:space="preserve">(quien arma el expediente, quien decide, quien cobra son roles distintos) protege a la firma y a cada integrante: ningún resultado depende de una sola persona.</w:t>
       </w:r>
     </w:p>
     <w:p>
@@ -1167,13 +1307,329 @@
       </w:r>
     </w:p>
     <w:bookmarkEnd w:id="25"/>
-    <w:bookmarkStart w:id="26" w:name="impacto-financiero"/>
+    <w:bookmarkStart w:id="26" w:name="cómo-funciona-flujo-de-trabajo-resumido"/>
     <w:p>
       <w:pPr>
         <w:pStyle w:val="Heading2"/>
       </w:pPr>
       <w:r>
-        <w:t xml:space="preserve">6. Impacto financiero</w:t>
+        <w:t xml:space="preserve">6. Cómo funciona (flujo de trabajo resumido)</w:t>
+      </w:r>
+    </w:p>
+    <w:p>
+      <w:pPr>
+        <w:pStyle w:val="FirstParagraph"/>
+      </w:pPr>
+      <w:r>
+        <w:t xml:space="preserve">Cada cuenta recorre cinco etapas, con un dueño claro en cada una:</w:t>
+      </w:r>
+    </w:p>
+    <w:p>
+      <w:pPr>
+        <w:numPr>
+          <w:ilvl w:val="0"/>
+          <w:numId w:val="1003"/>
+        </w:numPr>
+        <w:pStyle w:val="Compact"/>
+      </w:pPr>
+      <w:r>
+        <w:rPr>
+          <w:bCs/>
+          <w:b/>
+        </w:rPr>
+        <w:t xml:space="preserve">Identificación</w:t>
+      </w:r>
+      <w:r>
+        <w:t xml:space="preserve"> </w:t>
+      </w:r>
+      <w:r>
+        <w:rPr>
+          <w:iCs/>
+          <w:i/>
+        </w:rPr>
+        <w:t xml:space="preserve">(Contabilidad + Coord. CxC):</w:t>
+      </w:r>
+      <w:r>
+        <w:t xml:space="preserve"> </w:t>
+      </w:r>
+      <w:r>
+        <w:t xml:space="preserve">se detecta y carga la cuenta vencida.</w:t>
+      </w:r>
+    </w:p>
+    <w:p>
+      <w:pPr>
+        <w:numPr>
+          <w:ilvl w:val="0"/>
+          <w:numId w:val="1003"/>
+        </w:numPr>
+        <w:pStyle w:val="Compact"/>
+      </w:pPr>
+      <w:r>
+        <w:rPr>
+          <w:bCs/>
+          <w:b/>
+        </w:rPr>
+        <w:t xml:space="preserve">Expediente y priorización</w:t>
+      </w:r>
+      <w:r>
+        <w:t xml:space="preserve"> </w:t>
+      </w:r>
+      <w:r>
+        <w:rPr>
+          <w:iCs/>
+          <w:i/>
+        </w:rPr>
+        <w:t xml:space="preserve">(Coord. CxC):</w:t>
+      </w:r>
+      <w:r>
+        <w:t xml:space="preserve"> </w:t>
+      </w:r>
+      <w:r>
+        <w:t xml:space="preserve">se arma el expediente (saldo, devengado/no devengado,</w:t>
+      </w:r>
+      <w:r>
+        <w:t xml:space="preserve"> </w:t>
+      </w:r>
+      <w:r>
+        <w:rPr>
+          <w:bCs/>
+          <w:b/>
+        </w:rPr>
+        <w:t xml:space="preserve">próxima audiencia</w:t>
+      </w:r>
+      <w:r>
+        <w:t xml:space="preserve">) y se prioriza por urgencia de audiencia.</w:t>
+      </w:r>
+    </w:p>
+    <w:p>
+      <w:pPr>
+        <w:numPr>
+          <w:ilvl w:val="0"/>
+          <w:numId w:val="1003"/>
+        </w:numPr>
+        <w:pStyle w:val="Compact"/>
+      </w:pPr>
+      <w:r>
+        <w:rPr>
+          <w:bCs/>
+          <w:b/>
+        </w:rPr>
+        <w:t xml:space="preserve">Revisión legal</w:t>
+      </w:r>
+      <w:r>
+        <w:t xml:space="preserve"> </w:t>
+      </w:r>
+      <w:r>
+        <w:rPr>
+          <w:iCs/>
+          <w:i/>
+        </w:rPr>
+        <w:t xml:space="preserve">(Abogado):</w:t>
+      </w:r>
+      <w:r>
+        <w:t xml:space="preserve"> </w:t>
+      </w:r>
+      <w:r>
+        <w:t xml:space="preserve">decide</w:t>
+      </w:r>
+      <w:r>
+        <w:t xml:space="preserve"> </w:t>
+      </w:r>
+      <w:r>
+        <w:rPr>
+          <w:bCs/>
+          <w:b/>
+        </w:rPr>
+        <w:t xml:space="preserve">Vía A (cobrar)</w:t>
+      </w:r>
+      <w:r>
+        <w:t xml:space="preserve"> </w:t>
+      </w:r>
+      <w:r>
+        <w:t xml:space="preserve">o</w:t>
+      </w:r>
+      <w:r>
+        <w:t xml:space="preserve"> </w:t>
+      </w:r>
+      <w:r>
+        <w:rPr>
+          <w:bCs/>
+          <w:b/>
+        </w:rPr>
+        <w:t xml:space="preserve">Vía B (retirarse)</w:t>
+      </w:r>
+      <w:r>
+        <w:t xml:space="preserve"> </w:t>
+      </w:r>
+      <w:r>
+        <w:t xml:space="preserve">—</w:t>
+      </w:r>
+      <w:r>
+        <w:t xml:space="preserve"> </w:t>
+      </w:r>
+      <w:r>
+        <w:t xml:space="preserve">“</w:t>
+      </w:r>
+      <w:r>
+        <w:t xml:space="preserve">¿conviene retirarse o no?</w:t>
+      </w:r>
+      <w:r>
+        <w:t xml:space="preserve">”</w:t>
+      </w:r>
+      <w:r>
+        <w:t xml:space="preserve">.</w:t>
+      </w:r>
+    </w:p>
+    <w:p>
+      <w:pPr>
+        <w:numPr>
+          <w:ilvl w:val="0"/>
+          <w:numId w:val="1003"/>
+        </w:numPr>
+        <w:pStyle w:val="Compact"/>
+      </w:pPr>
+      <w:r>
+        <w:rPr>
+          <w:bCs/>
+          <w:b/>
+        </w:rPr>
+        <w:t xml:space="preserve">Ejecución</w:t>
+      </w:r>
+      <w:r>
+        <w:t xml:space="preserve"> </w:t>
+      </w:r>
+      <w:r>
+        <w:rPr>
+          <w:iCs/>
+          <w:i/>
+        </w:rPr>
+        <w:t xml:space="preserve">(Cobranza / Legal):</w:t>
+      </w:r>
+    </w:p>
+    <w:p>
+      <w:pPr>
+        <w:numPr>
+          <w:ilvl w:val="1"/>
+          <w:numId w:val="1004"/>
+        </w:numPr>
+        <w:pStyle w:val="Compact"/>
+      </w:pPr>
+      <w:r>
+        <w:rPr>
+          <w:bCs/>
+          <w:b/>
+        </w:rPr>
+        <w:t xml:space="preserve">Vía A:</w:t>
+      </w:r>
+      <w:r>
+        <w:t xml:space="preserve"> </w:t>
+      </w:r>
+      <w:r>
+        <w:t xml:space="preserve">cobranza contacta, negocia y formaliza el plan de pago.</w:t>
+      </w:r>
+    </w:p>
+    <w:p>
+      <w:pPr>
+        <w:numPr>
+          <w:ilvl w:val="1"/>
+          <w:numId w:val="1004"/>
+        </w:numPr>
+        <w:pStyle w:val="Compact"/>
+      </w:pPr>
+      <w:r>
+        <w:rPr>
+          <w:bCs/>
+          <w:b/>
+        </w:rPr>
+        <w:t xml:space="preserve">Vía B:</w:t>
+      </w:r>
+      <w:r>
+        <w:t xml:space="preserve"> </w:t>
+      </w:r>
+      <w:r>
+        <w:t xml:space="preserve">se notifica al cliente, se reembolsa lo no devengado y el abogado presenta la moción de retiro.</w:t>
+      </w:r>
+    </w:p>
+    <w:p>
+      <w:pPr>
+        <w:numPr>
+          <w:ilvl w:val="0"/>
+          <w:numId w:val="1003"/>
+        </w:numPr>
+        <w:pStyle w:val="Compact"/>
+      </w:pPr>
+      <w:r>
+        <w:rPr>
+          <w:bCs/>
+          <w:b/>
+        </w:rPr>
+        <w:t xml:space="preserve">Cierre y reporte</w:t>
+      </w:r>
+      <w:r>
+        <w:t xml:space="preserve"> </w:t>
+      </w:r>
+      <w:r>
+        <w:rPr>
+          <w:iCs/>
+          <w:i/>
+        </w:rPr>
+        <w:t xml:space="preserve">(Contabilidad):</w:t>
+      </w:r>
+      <w:r>
+        <w:t xml:space="preserve"> </w:t>
+      </w:r>
+      <w:r>
+        <w:t xml:space="preserve">se registra la resolución, se completa el expediente y se reporta a la Junta.</w:t>
+      </w:r>
+    </w:p>
+    <w:p>
+      <w:pPr>
+        <w:pStyle w:val="BlockText"/>
+      </w:pPr>
+      <w:r>
+        <w:t xml:space="preserve">El diagrama de carriles (swimlanes) con todos los pasos y puntos de decisión está en el</w:t>
+      </w:r>
+      <w:r>
+        <w:t xml:space="preserve"> </w:t>
+      </w:r>
+      <w:r>
+        <w:rPr>
+          <w:bCs/>
+          <w:b/>
+        </w:rPr>
+        <w:t xml:space="preserve">Workflow anexo</w:t>
+      </w:r>
+      <w:r>
+        <w:t xml:space="preserve"> </w:t>
+      </w:r>
+      <w:r>
+        <w:t xml:space="preserve">(</w:t>
+      </w:r>
+      <w:r>
+        <w:rPr>
+          <w:rStyle w:val="VerbatimChar"/>
+        </w:rPr>
+        <w:t xml:space="preserve">workflow-operacion.md</w:t>
+      </w:r>
+      <w:r>
+        <w:t xml:space="preserve">).</w:t>
+      </w:r>
+    </w:p>
+    <w:p>
+      <w:r>
+        <w:pict>
+          <v:rect style="width:0;height:1.5pt" o:hralign="center" o:hrstd="t" o:hr="t"/>
+        </w:pict>
+      </w:r>
+    </w:p>
+    <w:bookmarkEnd w:id="26"/>
+    <w:bookmarkStart w:id="27" w:name="impacto-financiero"/>
+    <w:p>
+      <w:pPr>
+        <w:pStyle w:val="Heading2"/>
+      </w:pPr>
+      <w:r>
+        <w:t xml:space="preserve">7. Impacto financiero</w:t>
       </w:r>
     </w:p>
     <w:tbl>
@@ -1253,7 +1709,7 @@
               <w:t xml:space="preserve"> </w:t>
             </w:r>
             <w:r>
-              <w:t xml:space="preserve">de &gt;$1M (a cuantificar en el triage)</w:t>
+              <w:t xml:space="preserve">de &gt;$1M (a cuantificar en la etapa de expediente)</w:t>
             </w:r>
           </w:p>
         </w:tc>
@@ -1279,7 +1735,7 @@
               <w:jc w:val="left"/>
             </w:pPr>
             <w:r>
-              <w:t xml:space="preserve">Evitar quejas, sanciones y costos de defensa disciplinaria — potencialmente</w:t>
+              <w:t xml:space="preserve">Evitar quejas, sanciones y costos de defensa — potencialmente</w:t>
             </w:r>
             <w:r>
               <w:t xml:space="preserve"> </w:t>
@@ -1321,7 +1777,7 @@
               <w:jc w:val="left"/>
             </w:pPr>
             <w:r>
-              <w:t xml:space="preserve">Función de resolución de 6 meses (apoyo + sistema)</w:t>
+              <w:t xml:space="preserve">Función de resolución de 6 meses (apoyo temporal + sistema/tablero)</w:t>
             </w:r>
           </w:p>
         </w:tc>
@@ -1365,14 +1821,14 @@
         </w:pict>
       </w:r>
     </w:p>
-    <w:bookmarkEnd w:id="26"/>
-    <w:bookmarkStart w:id="27" w:name="cronograma-y-hitos"/>
+    <w:bookmarkEnd w:id="27"/>
+    <w:bookmarkStart w:id="28" w:name="cronograma-y-hitos"/>
     <w:p>
       <w:pPr>
         <w:pStyle w:val="Heading2"/>
       </w:pPr>
       <w:r>
-        <w:t xml:space="preserve">7. Cronograma y hitos</w:t>
+        <w:t xml:space="preserve">8. Cronograma y hitos</w:t>
       </w:r>
     </w:p>
     <w:tbl>
@@ -1465,7 +1921,7 @@
               <w:jc w:val="left"/>
             </w:pPr>
             <w:r>
-              <w:t xml:space="preserve">Triage completo; criterios y plantillas aprobados; tablero operando</w:t>
+              <w:t xml:space="preserve">Expedientes y priorización; criterios y plantillas avalados; tablero operando</w:t>
             </w:r>
           </w:p>
         </w:tc>
@@ -1483,7 +1939,7 @@
                 <w:bCs/>
                 <w:b/>
               </w:rPr>
-              <w:t xml:space="preserve">1 — Apagar el incendio</w:t>
+              <w:t xml:space="preserve">1 — Prioridad crítica</w:t>
             </w:r>
           </w:p>
         </w:tc>
@@ -1511,7 +1967,7 @@
                 <w:bCs/>
                 <w:b/>
               </w:rPr>
-              <w:t xml:space="preserve">Todos los casos con audiencia próxima (P1) resueltos</w:t>
+              <w:t xml:space="preserve">Todas las cuentas con audiencia próxima resueltas</w:t>
             </w:r>
           </w:p>
         </w:tc>
@@ -1599,7 +2055,7 @@
                 <w:bCs/>
                 <w:b/>
               </w:rPr>
-              <w:t xml:space="preserve">0 casos sin resolver</w:t>
+              <w:t xml:space="preserve">0 cuentas sin resolver</w:t>
             </w:r>
             <w:r>
               <w:t xml:space="preserve">; documentación completa</w:t>
@@ -1617,7 +2073,7 @@
           <w:bCs/>
           <w:b/>
         </w:rPr>
-        <w:t xml:space="preserve">Métrica maestra de la Junta:</w:t>
+        <w:t xml:space="preserve">Métrica maestra:</w:t>
       </w:r>
       <w:r>
         <w:t xml:space="preserve"> </w:t>
@@ -1665,14 +2121,14 @@
         </w:pict>
       </w:r>
     </w:p>
-    <w:bookmarkEnd w:id="27"/>
-    <w:bookmarkStart w:id="28" w:name="decisiones-que-se-solicitan-a-la-junta"/>
+    <w:bookmarkEnd w:id="28"/>
+    <w:bookmarkStart w:id="29" w:name="Xd734c23fefca3a79c30d35485099a8be4e28017"/>
     <w:p>
       <w:pPr>
         <w:pStyle w:val="Heading2"/>
       </w:pPr>
       <w:r>
-        <w:t xml:space="preserve">8. Decisiones que se solicitan a la Junta</w:t>
+        <w:t xml:space="preserve">9. Decisiones que el equipo solicita a la Junta</w:t>
       </w:r>
     </w:p>
     <w:p>
@@ -1693,17 +2149,14 @@
         <w:t xml:space="preserve">el plan de la firma</w:t>
       </w:r>
       <w:r>
-        <w:t xml:space="preserve"> </w:t>
-      </w:r>
-      <w:r>
-        <w:t xml:space="preserve">(no de una persona), se pide a la Junta aprobar:</w:t>
+        <w:t xml:space="preserve">, el equipo pide a la Junta avalar:</w:t>
       </w:r>
     </w:p>
     <w:p>
       <w:pPr>
         <w:numPr>
           <w:ilvl w:val="0"/>
-          <w:numId w:val="1003"/>
+          <w:numId w:val="1005"/>
         </w:numPr>
         <w:pStyle w:val="Compact"/>
       </w:pPr>
@@ -1746,14 +2199,14 @@
         <w:t xml:space="preserve"> </w:t>
       </w:r>
       <w:r>
-        <w:t xml:space="preserve">como estándar de la firma para toda cuenta vencida.</w:t>
+        <w:t xml:space="preserve">como estándar para toda cuenta vencida.</w:t>
       </w:r>
     </w:p>
     <w:p>
       <w:pPr>
         <w:numPr>
           <w:ilvl w:val="0"/>
-          <w:numId w:val="1003"/>
+          <w:numId w:val="1005"/>
         </w:numPr>
         <w:pStyle w:val="Compact"/>
       </w:pPr>
@@ -1768,14 +2221,14 @@
         <w:t xml:space="preserve"> </w:t>
       </w:r>
       <w:r>
-        <w:t xml:space="preserve">con la estructura de la Sección 5 (apoyo de documentación + sistema/tablero).</w:t>
+        <w:t xml:space="preserve">con la estructura de la Sección 5.</w:t>
       </w:r>
     </w:p>
     <w:p>
       <w:pPr>
         <w:numPr>
           <w:ilvl w:val="0"/>
-          <w:numId w:val="1003"/>
+          <w:numId w:val="1005"/>
         </w:numPr>
         <w:pStyle w:val="Compact"/>
       </w:pPr>
@@ -1784,20 +2237,20 @@
           <w:bCs/>
           <w:b/>
         </w:rPr>
-        <w:t xml:space="preserve">Delegar en la abogada responsable</w:t>
-      </w:r>
-      <w:r>
-        <w:t xml:space="preserve"> </w:t>
-      </w:r>
-      <w:r>
-        <w:t xml:space="preserve">la autoridad para aprobar criterios A/B, reembolsos de lo no devengado y descuentos de cobro dentro de un rango definido.</w:t>
+        <w:t xml:space="preserve">Confirmar que la decisión de retiro</w:t>
+      </w:r>
+      <w:r>
+        <w:t xml:space="preserve"> </w:t>
+      </w:r>
+      <w:r>
+        <w:t xml:space="preserve">recae en el abogado revisor, con criterios claros.</w:t>
       </w:r>
     </w:p>
     <w:p>
       <w:pPr>
         <w:numPr>
           <w:ilvl w:val="0"/>
-          <w:numId w:val="1003"/>
+          <w:numId w:val="1005"/>
         </w:numPr>
         <w:pStyle w:val="Compact"/>
       </w:pPr>
@@ -1806,20 +2259,20 @@
           <w:bCs/>
           <w:b/>
         </w:rPr>
-        <w:t xml:space="preserve">Aprobar la inversión</w:t>
-      </w:r>
-      <w:r>
-        <w:t xml:space="preserve"> </w:t>
-      </w:r>
-      <w:r>
-        <w:t xml:space="preserve">en el apoyo y las herramientas necesarias.</w:t>
+        <w:t xml:space="preserve">Aprobar el apoyo temporal y las herramientas</w:t>
+      </w:r>
+      <w:r>
+        <w:t xml:space="preserve"> </w:t>
+      </w:r>
+      <w:r>
+        <w:t xml:space="preserve">necesarias.</w:t>
       </w:r>
     </w:p>
     <w:p>
       <w:pPr>
         <w:numPr>
           <w:ilvl w:val="0"/>
-          <w:numId w:val="1003"/>
+          <w:numId w:val="1005"/>
         </w:numPr>
         <w:pStyle w:val="Compact"/>
       </w:pPr>
@@ -1834,7 +2287,7 @@
         <w:t xml:space="preserve"> </w:t>
       </w:r>
       <w:r>
-        <w:t xml:space="preserve">de avance contra los hitos y KPIs.</w:t>
+        <w:t xml:space="preserve">de avance contra hitos y KPIs.</w:t>
       </w:r>
     </w:p>
     <w:p>
@@ -1844,14 +2297,14 @@
         </w:pict>
       </w:r>
     </w:p>
-    <w:bookmarkEnd w:id="28"/>
-    <w:bookmarkStart w:id="29" w:name="el-costo-de-no-actuar"/>
+    <w:bookmarkEnd w:id="29"/>
+    <w:bookmarkStart w:id="30" w:name="el-costo-de-no-actuar"/>
     <w:p>
       <w:pPr>
         <w:pStyle w:val="Heading2"/>
       </w:pPr>
       <w:r>
-        <w:t xml:space="preserve">9. El costo de no actuar</w:t>
+        <w:t xml:space="preserve">10. El costo de no actuar</w:t>
       </w:r>
     </w:p>
     <w:tbl>
@@ -1903,7 +2356,7 @@
               <w:jc w:val="left"/>
             </w:pPr>
             <w:r>
-              <w:t xml:space="preserve">Cuentas con audiencia siguen sin resolverse</w:t>
+              <w:t xml:space="preserve">Cuentas con audiencia sin resolver</w:t>
             </w:r>
           </w:p>
         </w:tc>
@@ -1990,38 +2443,20 @@
       </w:tr>
     </w:tbl>
     <w:p>
-      <w:pPr>
-        <w:pStyle w:val="BodyText"/>
-      </w:pPr>
-      <w:r>
-        <w:rPr>
-          <w:bCs/>
-          <w:b/>
-        </w:rPr>
-        <w:t xml:space="preserve">Conclusión:</w:t>
-      </w:r>
-      <w:r>
-        <w:t xml:space="preserve"> </w:t>
-      </w:r>
-      <w:r>
-        <w:t xml:space="preserve">la inacción convierte un problema de cartera manejable en un riesgo para la viabilidad de la firma. El plan lo revierte y, al hacerlo bien, restaura la credibilidad ante la Corte.</w:t>
-      </w:r>
-    </w:p>
-    <w:p>
       <w:r>
         <w:pict>
           <v:rect style="width:0;height:1.5pt" o:hralign="center" o:hrstd="t" o:hr="t"/>
         </w:pict>
       </w:r>
     </w:p>
-    <w:bookmarkEnd w:id="29"/>
-    <w:bookmarkStart w:id="30" w:name="recomendación"/>
+    <w:bookmarkEnd w:id="30"/>
+    <w:bookmarkStart w:id="31" w:name="recomendación-del-equipo"/>
     <w:p>
       <w:pPr>
         <w:pStyle w:val="Heading2"/>
       </w:pPr>
       <w:r>
-        <w:t xml:space="preserve">10. Recomendación</w:t>
+        <w:t xml:space="preserve">11. Recomendación del equipo</w:t>
       </w:r>
     </w:p>
     <w:p>
@@ -2029,7 +2464,7 @@
         <w:pStyle w:val="FirstParagraph"/>
       </w:pPr>
       <w:r>
-        <w:t xml:space="preserve">Aprobar el plan tal como se presenta e iniciar la Fase 0 de inmediato, priorizando los casos con audiencias próximas. La firma tiene una ventana para corregir el rumbo</w:t>
+        <w:t xml:space="preserve">El equipo recomienda a la Junta avalar el plan tal como se presenta e iniciar la Fase 0 de inmediato, priorizando las cuentas con audiencias próximas. La firma tiene la oportunidad de corregir el rumbo</w:t>
       </w:r>
       <w:r>
         <w:t xml:space="preserve"> </w:t>
@@ -2045,7 +2480,7 @@
         <w:t xml:space="preserve"> </w:t>
       </w:r>
       <w:r>
-        <w:t xml:space="preserve">— antes de que la corrección venga impuesta desde afuera.</w:t>
+        <w:t xml:space="preserve">— antes de que la corrección venga impuesta desde afuera. Presentarlo como una decisión conjunta de la Junta y del equipo es, además, la mejor garantía de que se ejecute con respaldo institucional.</w:t>
       </w:r>
     </w:p>
     <w:p>
@@ -2064,7 +2499,7 @@
           <w:iCs/>
           <w:i/>
         </w:rPr>
-        <w:t xml:space="preserve">Anexo: Plan de Ejecución detallado (</w:t>
+        <w:t xml:space="preserve">Anexos: (1) Workflow de la operación (</w:t>
       </w:r>
       <w:r>
         <w:rPr>
@@ -2072,18 +2507,33 @@
           <w:iCs/>
           <w:i/>
         </w:rPr>
-        <w:t xml:space="preserve">plan-resolucion-cuentas-morosas.md</w:t>
+        <w:t xml:space="preserve">workflow-operacion.md</w:t>
       </w:r>
       <w:r>
         <w:rPr>
           <w:iCs/>
           <w:i/>
         </w:rPr>
-        <w:t xml:space="preserve">) — triage, vías A/B paso a paso, paquete de documentación por caso, tablero, KPIs y gestión de riesgos. Todos los procedimientos de retiro y cobranza serán aprobados por la abogada responsable y verificados contra las reglas de conducta profesional y el Immigration Court Practice Manual (EOIR) antes de ejecutarse. Disponible en inglés a solicitud.</w:t>
-      </w:r>
-    </w:p>
-    <w:bookmarkEnd w:id="30"/>
+        <w:t xml:space="preserve">); (2) Plan de Ejecución detallado (</w:t>
+      </w:r>
+      <w:r>
+        <w:rPr>
+          <w:rStyle w:val="VerbatimChar"/>
+          <w:iCs/>
+          <w:i/>
+        </w:rPr>
+        <w:t xml:space="preserve">plan-resolucion-cuentas-morosas.md</w:t>
+      </w:r>
+      <w:r>
+        <w:rPr>
+          <w:iCs/>
+          <w:i/>
+        </w:rPr>
+        <w:t xml:space="preserve">). Todos los procedimientos de retiro y cobranza serán aprobados por el abogado revisor y verificados contra las reglas de conducta profesional y el Immigration Court Practice Manual (EOIR) antes de ejecutarse. Disponible en inglés a solicitud.</w:t>
+      </w:r>
+    </w:p>
     <w:bookmarkEnd w:id="31"/>
+    <w:bookmarkEnd w:id="32"/>
     <w:sectPr/>
   </w:body>
 </w:document>
@@ -2361,6 +2811,39 @@
     <w:abstractNumId w:val="991"/>
   </w:num>
   <w:num w:numId="1003">
+    <w:abstractNumId w:val="99411"/>
+    <w:lvlOverride w:ilvl="0">
+      <w:startOverride w:val="1"/>
+    </w:lvlOverride>
+    <w:lvlOverride w:ilvl="1">
+      <w:startOverride w:val="1"/>
+    </w:lvlOverride>
+    <w:lvlOverride w:ilvl="2">
+      <w:startOverride w:val="1"/>
+    </w:lvlOverride>
+    <w:lvlOverride w:ilvl="3">
+      <w:startOverride w:val="1"/>
+    </w:lvlOverride>
+    <w:lvlOverride w:ilvl="4">
+      <w:startOverride w:val="1"/>
+    </w:lvlOverride>
+    <w:lvlOverride w:ilvl="5">
+      <w:startOverride w:val="1"/>
+    </w:lvlOverride>
+    <w:lvlOverride w:ilvl="6">
+      <w:startOverride w:val="1"/>
+    </w:lvlOverride>
+    <w:lvlOverride w:ilvl="7">
+      <w:startOverride w:val="1"/>
+    </w:lvlOverride>
+    <w:lvlOverride w:ilvl="8">
+      <w:startOverride w:val="1"/>
+    </w:lvlOverride>
+  </w:num>
+  <w:num w:numId="1004">
+    <w:abstractNumId w:val="991"/>
+  </w:num>
+  <w:num w:numId="1005">
     <w:abstractNumId w:val="99411"/>
     <w:lvlOverride w:ilvl="0">
       <w:startOverride w:val="1"/>

</xml_diff>